<commit_message>
feat: setup database connection with SQL Server
</commit_message>
<xml_diff>
--- a/docs/NoiDungMoTaDuAn.docx
+++ b/docs/NoiDungMoTaDuAn.docx
@@ -893,7 +893,7 @@
           <w:szCs w:val="26"/>
         </w:rPr>
         <w:pict w14:anchorId="2F34BF7D">
-          <v:rect id="_x0000_i1321" style="width:0;height:1.5pt" o:hralign="center" o:hrstd="t" o:hr="t" fillcolor="#a0a0a0" stroked="f"/>
+          <v:rect id="_x0000_i1025" style="width:0;height:1.5pt" o:hralign="center" o:hrstd="t" o:hr="t" fillcolor="#a0a0a0" stroked="f"/>
         </w:pict>
       </w:r>
     </w:p>
@@ -4374,6 +4374,53 @@
         </w:rPr>
         <w:t>chỉ cần đọc /config + /modules</w:t>
       </w:r>
+    </w:p>
+    <w:p>
+      <w:pPr>
+        <w:rPr>
+          <w:rFonts w:asciiTheme="majorHAnsi" w:hAnsiTheme="majorHAnsi" w:cstheme="majorHAnsi"/>
+          <w:sz w:val="26"/>
+          <w:szCs w:val="26"/>
+          <w:lang w:val="en-US"/>
+        </w:rPr>
+      </w:pPr>
+      <w:r>
+        <w:rPr>
+          <w:rFonts w:asciiTheme="majorHAnsi" w:hAnsiTheme="majorHAnsi" w:cstheme="majorHAnsi"/>
+          <w:sz w:val="26"/>
+          <w:szCs w:val="26"/>
+          <w:lang w:val="en-US"/>
+        </w:rPr>
+        <w:lastRenderedPageBreak/>
+        <w:t>Config:</w:t>
+      </w:r>
+      <w:r>
+        <w:rPr>
+          <w:rFonts w:asciiTheme="majorHAnsi" w:hAnsiTheme="majorHAnsi" w:cstheme="majorHAnsi"/>
+          <w:sz w:val="26"/>
+          <w:szCs w:val="26"/>
+          <w:lang w:val="en-US"/>
+        </w:rPr>
+        <w:br/>
+      </w:r>
+      <w:r>
+        <w:rPr>
+          <w:rFonts w:asciiTheme="majorHAnsi" w:hAnsiTheme="majorHAnsi" w:cstheme="majorHAnsi"/>
+          <w:sz w:val="26"/>
+          <w:szCs w:val="26"/>
+          <w:lang w:val="en-US"/>
+        </w:rPr>
+        <w:t>pm install @nestjs/typeorm typeorm mssql</w:t>
+      </w:r>
+    </w:p>
+    <w:p>
+      <w:pPr>
+        <w:rPr>
+          <w:rFonts w:asciiTheme="majorHAnsi" w:hAnsiTheme="majorHAnsi" w:cstheme="majorHAnsi"/>
+          <w:sz w:val="26"/>
+          <w:szCs w:val="26"/>
+        </w:rPr>
+      </w:pPr>
     </w:p>
     <w:sectPr>
       <w:pgSz w:w="11906" w:h="16838"/>
@@ -10281,6 +10328,7 @@
   <w:style w:type="character" w:default="1" w:styleId="DefaultParagraphFont">
     <w:name w:val="Default Paragraph Font"/>
     <w:uiPriority w:val="1"/>
+    <w:semiHidden/>
     <w:unhideWhenUsed/>
   </w:style>
   <w:style w:type="table" w:default="1" w:styleId="TableNormal">

</xml_diff>

<commit_message>
feat(auth): implement authentication module
- Add BaseEntity, BaseService, BaseController for reusable CRUD
- Add User module with entity, service, controller
- Add Role entity with relation to match database schema
- Add Auth module with register, login, refresh token, logout
- Add JWT strategy and RefreshToken strategy
- Add RefreshToken entity for database storage
- Add global exception filter for centralized error handling
- Add transform interceptor for standardized API response
- Add JWT guard with public decorator
- Add bcrypt for password hashing
- Add validation DTOs with class-validator
- Add configuration management with ConfigModule
- Add .env.example for environment variables template
</commit_message>
<xml_diff>
--- a/docs/NoiDungMoTaDuAn.docx
+++ b/docs/NoiDungMoTaDuAn.docx
@@ -4421,6 +4421,31 @@
           <w:szCs w:val="26"/>
         </w:rPr>
       </w:pPr>
+      <w:r>
+        <w:rPr>
+          <w:rFonts w:asciiTheme="majorHAnsi" w:hAnsiTheme="majorHAnsi" w:cstheme="majorHAnsi"/>
+          <w:sz w:val="26"/>
+          <w:szCs w:val="26"/>
+        </w:rPr>
+        <w:t>npm install @nestjs/passport passport passport-jwt @nestjs/jwt bcrypt</w:t>
+      </w:r>
+    </w:p>
+    <w:p>
+      <w:pPr>
+        <w:rPr>
+          <w:rFonts w:asciiTheme="majorHAnsi" w:hAnsiTheme="majorHAnsi" w:cstheme="majorHAnsi"/>
+          <w:sz w:val="26"/>
+          <w:szCs w:val="26"/>
+        </w:rPr>
+      </w:pPr>
+      <w:r>
+        <w:rPr>
+          <w:rFonts w:asciiTheme="majorHAnsi" w:hAnsiTheme="majorHAnsi" w:cstheme="majorHAnsi"/>
+          <w:sz w:val="26"/>
+          <w:szCs w:val="26"/>
+        </w:rPr>
+        <w:t>npm install -D @types/passport-jwt @types/bcrypt</w:t>
+      </w:r>
     </w:p>
     <w:sectPr>
       <w:pgSz w:w="11906" w:h="16838"/>

</xml_diff>

<commit_message>
feat: merge email security and approval logic to main
</commit_message>
<xml_diff>
--- a/docs/NoiDungMoTaDuAn.docx
+++ b/docs/NoiDungMoTaDuAn.docx
@@ -4421,6 +4421,31 @@
           <w:szCs w:val="26"/>
         </w:rPr>
       </w:pPr>
+      <w:r>
+        <w:rPr>
+          <w:rFonts w:asciiTheme="majorHAnsi" w:hAnsiTheme="majorHAnsi" w:cstheme="majorHAnsi"/>
+          <w:sz w:val="26"/>
+          <w:szCs w:val="26"/>
+        </w:rPr>
+        <w:t>npm install @nestjs/passport passport passport-jwt @nestjs/jwt bcrypt</w:t>
+      </w:r>
+    </w:p>
+    <w:p>
+      <w:pPr>
+        <w:rPr>
+          <w:rFonts w:asciiTheme="majorHAnsi" w:hAnsiTheme="majorHAnsi" w:cstheme="majorHAnsi"/>
+          <w:sz w:val="26"/>
+          <w:szCs w:val="26"/>
+        </w:rPr>
+      </w:pPr>
+      <w:r>
+        <w:rPr>
+          <w:rFonts w:asciiTheme="majorHAnsi" w:hAnsiTheme="majorHAnsi" w:cstheme="majorHAnsi"/>
+          <w:sz w:val="26"/>
+          <w:szCs w:val="26"/>
+        </w:rPr>
+        <w:t>npm install -D @types/passport-jwt @types/bcrypt</w:t>
+      </w:r>
     </w:p>
     <w:sectPr>
       <w:pgSz w:w="11906" w:h="16838"/>

</xml_diff>